<commit_message>
Changes to written repport
</commit_message>
<xml_diff>
--- a/Rapport malloc et free groupe 17.docx
+++ b/Rapport malloc et free groupe 17.docx
@@ -34,22 +34,7 @@
         <w:rPr>
           <w:lang w:eastAsia="fr-FR"/>
         </w:rPr>
-        <w:t>Pour réaliser my_malloc et my_free, on utilise un tableau de uint8_t de 64000 cases afin de simuler une heap de 64000 octets. Cette heap est divisée en blocs contigus, libres ou occupés</w:t>
-      </w:r>
-      <w:r>
-        <w:rPr>
-          <w:lang w:eastAsia="fr-FR"/>
-        </w:rPr>
-        <w:t xml:space="preserve">. Pour trouver le bloc suivant </w:t>
-      </w:r>
-      <w:r>
-        <w:t>il suffit d’avancer de la taille du bloc actuel</w:t>
-      </w:r>
-      <w:r>
-        <w:rPr>
-          <w:lang w:eastAsia="fr-FR"/>
-        </w:rPr>
-        <w:t>.</w:t>
+        <w:t>Pour réaliser my_malloc et my_free, on utilise un tableau de uint8_t de 64000 cases afin de simuler une heap de 64000 octets. Cette heap est divisée en blocs contigus, libres ou occupés.</w:t>
       </w:r>
     </w:p>
     <w:p>
@@ -62,19 +47,7 @@
         <w:rPr>
           <w:lang w:eastAsia="fr-FR"/>
         </w:rPr>
-        <w:t>Pour connaître la taille et la disponibilité d</w:t>
-      </w:r>
-      <w:r>
-        <w:rPr>
-          <w:lang w:eastAsia="fr-FR"/>
-        </w:rPr>
-        <w:t xml:space="preserve">’un </w:t>
-      </w:r>
-      <w:r>
-        <w:rPr>
-          <w:lang w:eastAsia="fr-FR"/>
-        </w:rPr>
-        <w:t xml:space="preserve">bloc, on utilise 2 octets de métadonnées placés au </w:t>
+        <w:t xml:space="preserve">Pour connaître la taille et la disponibilité d’un bloc, on utilise 2 octets de métadonnées placés au </w:t>
       </w:r>
       <w:r>
         <w:rPr>
@@ -98,61 +71,61 @@
         <w:rPr>
           <w:lang w:eastAsia="fr-FR"/>
         </w:rPr>
-        <w:t xml:space="preserve">. Le premier contient les 8 bits de poids fort de la taille et le second les 8 bits de poids faible. Les tailles étant toujours paires, le bit de poids faible du second octet </w:t>
-      </w:r>
-      <w:r>
-        <w:rPr>
-          <w:lang w:eastAsia="fr-FR"/>
-        </w:rPr>
-        <w:t>est utilisé comme</w:t>
-      </w:r>
-      <w:r>
-        <w:rPr>
-          <w:lang w:eastAsia="fr-FR"/>
-        </w:rPr>
-        <w:t xml:space="preserve"> flag pour savoir si un bloc est libre ou s’il est occupé</w:t>
-      </w:r>
-      <w:r>
-        <w:rPr>
-          <w:lang w:eastAsia="fr-FR"/>
-        </w:rPr>
-        <w:t xml:space="preserve"> </w:t>
-      </w:r>
-      <w:r>
-        <w:rPr>
-          <w:lang w:eastAsia="fr-FR"/>
-        </w:rPr>
-        <w:t xml:space="preserve">(0 = libre, 1 = occupé) et les 15 autres bits </w:t>
-      </w:r>
-      <w:r>
-        <w:rPr>
-          <w:lang w:eastAsia="fr-FR"/>
-        </w:rPr>
-        <w:t>nous permettent de conna</w:t>
-      </w:r>
-      <w:r>
-        <w:rPr>
-          <w:lang w:eastAsia="fr-FR"/>
-        </w:rPr>
-        <w:t>î</w:t>
-      </w:r>
-      <w:r>
-        <w:rPr>
-          <w:lang w:eastAsia="fr-FR"/>
-        </w:rPr>
-        <w:t>tre</w:t>
-      </w:r>
-      <w:r>
-        <w:rPr>
-          <w:lang w:eastAsia="fr-FR"/>
-        </w:rPr>
-        <w:t xml:space="preserve"> la taille</w:t>
-      </w:r>
-      <w:r>
-        <w:rPr>
-          <w:lang w:eastAsia="fr-FR"/>
-        </w:rPr>
-        <w:t xml:space="preserve"> du bloc</w:t>
+        <w:t>. Le premier contient les 8 bits de poids fort de la taille et le second les 8 bits de poids faible.</w:t>
+      </w:r>
+      <w:r>
+        <w:rPr>
+          <w:lang w:eastAsia="fr-FR"/>
+        </w:rPr>
+        <w:t xml:space="preserve"> Ceci est nécessaire parce que </w:t>
+      </w:r>
+      <w:r>
+        <w:rPr>
+          <w:lang w:eastAsia="fr-FR"/>
+        </w:rPr>
+        <w:t>le type uint8_t est limité à 8 bits, ne permettant de représenter des nombres entiers n’allant que jusqu’à 255.</w:t>
+      </w:r>
+      <w:r>
+        <w:rPr>
+          <w:lang w:eastAsia="fr-FR"/>
+        </w:rPr>
+        <w:t xml:space="preserve"> En en mettant 2 </w:t>
+      </w:r>
+      <w:r>
+        <w:rPr>
+          <w:lang w:eastAsia="fr-FR"/>
+        </w:rPr>
+        <w:t>côtes</w:t>
+      </w:r>
+      <w:r>
+        <w:rPr>
+          <w:lang w:eastAsia="fr-FR"/>
+        </w:rPr>
+        <w:t xml:space="preserve"> à côte</w:t>
+      </w:r>
+      <w:r>
+        <w:rPr>
+          <w:lang w:eastAsia="fr-FR"/>
+        </w:rPr>
+        <w:t>s</w:t>
+      </w:r>
+      <w:r>
+        <w:rPr>
+          <w:lang w:eastAsia="fr-FR"/>
+        </w:rPr>
+        <w:t xml:space="preserve">, nous avons donc 16 bits, nous permettant de représenter des nombres entiers allant jusqu’à </w:t>
+      </w:r>
+      <w:r>
+        <w:rPr>
+          <w:lang w:eastAsia="fr-FR"/>
+        </w:rPr>
+        <w:t>65535</w:t>
+      </w:r>
+      <w:r>
+        <w:rPr>
+          <w:lang w:eastAsia="fr-FR"/>
+        </w:rPr>
+        <w:t>, ce qui permet de représenter l’entièreté de la heap vide (64000)</w:t>
       </w:r>
       <w:r>
         <w:rPr>
@@ -171,7 +144,97 @@
         <w:rPr>
           <w:lang w:eastAsia="fr-FR"/>
         </w:rPr>
-        <w:t>L'utilisation de 2 octets pour les métadonnées permet d'avoir, à l'initialisation, un seul bloc libre qui représente la totalité de la heap.</w:t>
+        <w:t xml:space="preserve"> Les tailles étant toujours paires</w:t>
+      </w:r>
+      <w:r>
+        <w:rPr>
+          <w:lang w:eastAsia="fr-FR"/>
+        </w:rPr>
+        <w:t xml:space="preserve"> grâce au padding de 2 utilisé</w:t>
+      </w:r>
+      <w:r>
+        <w:rPr>
+          <w:lang w:eastAsia="fr-FR"/>
+        </w:rPr>
+        <w:t xml:space="preserve">, le bit de poids faible du second octet </w:t>
+      </w:r>
+      <w:r>
+        <w:rPr>
+          <w:lang w:eastAsia="fr-FR"/>
+        </w:rPr>
+        <w:t>est utilisé comme</w:t>
+      </w:r>
+      <w:r>
+        <w:rPr>
+          <w:lang w:eastAsia="fr-FR"/>
+        </w:rPr>
+        <w:t xml:space="preserve"> flag pour savoir si un bloc est libre ou s’il est occupé</w:t>
+      </w:r>
+      <w:r>
+        <w:rPr>
+          <w:lang w:eastAsia="fr-FR"/>
+        </w:rPr>
+        <w:t xml:space="preserve"> </w:t>
+      </w:r>
+      <w:r>
+        <w:rPr>
+          <w:lang w:eastAsia="fr-FR"/>
+        </w:rPr>
+        <w:t>(0 = libre, 1 = occupé) et les 15 autres bits</w:t>
+      </w:r>
+      <w:r>
+        <w:rPr>
+          <w:lang w:eastAsia="fr-FR"/>
+        </w:rPr>
+        <w:t xml:space="preserve"> mis bout à bout</w:t>
+      </w:r>
+      <w:r>
+        <w:rPr>
+          <w:lang w:eastAsia="fr-FR"/>
+        </w:rPr>
+        <w:t xml:space="preserve"> </w:t>
+      </w:r>
+      <w:r>
+        <w:rPr>
+          <w:lang w:eastAsia="fr-FR"/>
+        </w:rPr>
+        <w:t>nous permettent de conna</w:t>
+      </w:r>
+      <w:r>
+        <w:rPr>
+          <w:lang w:eastAsia="fr-FR"/>
+        </w:rPr>
+        <w:t>î</w:t>
+      </w:r>
+      <w:r>
+        <w:rPr>
+          <w:lang w:eastAsia="fr-FR"/>
+        </w:rPr>
+        <w:t>tre</w:t>
+      </w:r>
+      <w:r>
+        <w:rPr>
+          <w:lang w:eastAsia="fr-FR"/>
+        </w:rPr>
+        <w:t xml:space="preserve"> la taille</w:t>
+      </w:r>
+      <w:r>
+        <w:rPr>
+          <w:lang w:eastAsia="fr-FR"/>
+        </w:rPr>
+        <w:t xml:space="preserve"> du bloc</w:t>
+      </w:r>
+      <w:r>
+        <w:rPr>
+          <w:lang w:eastAsia="fr-FR"/>
+        </w:rPr>
+        <w:t>.</w:t>
+      </w:r>
+      <w:r>
+        <w:rPr>
+          <w:lang w:eastAsia="fr-FR"/>
+        </w:rPr>
+        <w:t xml:space="preserve"> (On shift les 8 bits de poids fort de 8 vers la gauche et on utilise un masque 0b11111110 pour les 8 bits de poids faible afin de ne pas prendre en compte le bit de flag. En additionnant ces deux nombres binaires, nous obtenons la taille réelle du bloc.</w:t>
       </w:r>
     </w:p>
     <w:p>
@@ -185,9 +248,9 @@
           <w:lang w:eastAsia="fr-FR"/>
         </w:rPr>
         <w:drawing>
-          <wp:inline distT="0" distB="0" distL="0" distR="0" wp14:anchorId="0F3650CF" wp14:editId="31FC5A37">
-            <wp:extent cx="4320000" cy="2435400"/>
-            <wp:effectExtent l="0" t="0" r="4445" b="3175"/>
+          <wp:inline distT="0" distB="0" distL="0" distR="0" wp14:anchorId="0F3650CF" wp14:editId="7EFDF1F3">
+            <wp:extent cx="3287865" cy="1853534"/>
+            <wp:effectExtent l="0" t="0" r="8255" b="0"/>
             <wp:docPr id="319770583" name="Graphique 2"/>
             <wp:cNvGraphicFramePr>
               <a:graphicFrameLocks xmlns:a="http://schemas.openxmlformats.org/drawingml/2006/main" noChangeAspect="1"/>
@@ -214,7 +277,7 @@
                   <pic:spPr>
                     <a:xfrm>
                       <a:off x="0" y="0"/>
-                      <a:ext cx="4320000" cy="2435400"/>
+                      <a:ext cx="3295344" cy="1857750"/>
                     </a:xfrm>
                     <a:prstGeom prst="rect">
                       <a:avLst/>
@@ -229,33 +292,20 @@
     </w:p>
     <w:p>
       <w:pPr>
-        <w:pStyle w:val="Lgende"/>
+        <w:pStyle w:val="Caption"/>
         <w:jc w:val="center"/>
-        <w:rPr>
-          <w:lang w:eastAsia="fr-FR"/>
-        </w:rPr>
       </w:pPr>
       <w:r>
         <w:t xml:space="preserve">Figure </w:t>
       </w:r>
-      <w:r>
-        <w:fldChar w:fldCharType="begin"/>
-      </w:r>
-      <w:r>
-        <w:instrText xml:space="preserve"> SEQ Figure \* ARABIC </w:instrText>
-      </w:r>
-      <w:r>
-        <w:fldChar w:fldCharType="separate"/>
-      </w:r>
-      <w:r>
-        <w:rPr>
-          <w:noProof/>
-        </w:rPr>
-        <w:t>1</w:t>
-      </w:r>
-      <w:r>
-        <w:fldChar w:fldCharType="end"/>
-      </w:r>
+      <w:fldSimple w:instr=" SEQ Figure \* ARABIC ">
+        <w:r>
+          <w:rPr>
+            <w:noProof/>
+          </w:rPr>
+          <w:t>1</w:t>
+        </w:r>
+      </w:fldSimple>
       <w:r>
         <w:t xml:space="preserve"> </w:t>
       </w:r>
@@ -276,31 +326,139 @@
         <w:rPr>
           <w:lang w:eastAsia="fr-FR"/>
         </w:rPr>
-        <w:t xml:space="preserve">Au niveau de l'algorithme, </w:t>
-      </w:r>
-      <w:r>
-        <w:rPr>
-          <w:lang w:eastAsia="fr-FR"/>
-        </w:rPr>
-        <w:t xml:space="preserve">la fonction </w:t>
-      </w:r>
-      <w:r>
-        <w:rPr>
-          <w:lang w:eastAsia="fr-FR"/>
-        </w:rPr>
-        <w:t>my_malloc calcule d'abord la taille réelle du bloc</w:t>
-      </w:r>
-      <w:r>
-        <w:rPr>
-          <w:lang w:eastAsia="fr-FR"/>
-        </w:rPr>
-        <w:t>, c</w:t>
-      </w:r>
-      <w:r>
-        <w:rPr>
-          <w:lang w:eastAsia="fr-FR"/>
-        </w:rPr>
-        <w:t>’est-à-dire</w:t>
+        <w:t xml:space="preserve">Au niveau algorithmique, my_malloc commence par calculer la taille réelle qui va être nécessaire sur base de la taille demandée à laquelle on ajoute 2, pour les octets de métadonnées et </w:t>
+      </w:r>
+      <w:r>
+        <w:rPr>
+          <w:lang w:eastAsia="fr-FR"/>
+        </w:rPr>
+        <w:t>qu’on arrondit au nombre pair suppérieur pour toujours avoir une taille paire et que le bit de poids le plus faible puisse toujours servir de flag.</w:t>
+      </w:r>
+      <w:r>
+        <w:rPr>
+          <w:lang w:eastAsia="fr-FR"/>
+        </w:rPr>
+        <w:br/>
+      </w:r>
+      <w:r>
+        <w:rPr>
+          <w:lang w:eastAsia="fr-FR"/>
+        </w:rPr>
+        <w:t>Ensuite la fonction</w:t>
+      </w:r>
+      <w:r>
+        <w:rPr>
+          <w:lang w:eastAsia="fr-FR"/>
+        </w:rPr>
+        <w:t xml:space="preserve"> parcourt la heap bloc par bloc afin de trouver un bloc suffisamment grand par rapport à la taille demand</w:t>
+      </w:r>
+      <w:r>
+        <w:rPr>
+          <w:lang w:eastAsia="fr-FR"/>
+        </w:rPr>
+        <w:t>ée</w:t>
+      </w:r>
+      <w:r>
+        <w:rPr>
+          <w:lang w:eastAsia="fr-FR"/>
+        </w:rPr>
+        <w:t>. Pour</w:t>
+      </w:r>
+      <w:r>
+        <w:rPr>
+          <w:lang w:eastAsia="fr-FR"/>
+        </w:rPr>
+        <w:t xml:space="preserve"> cela,</w:t>
+      </w:r>
+      <w:r>
+        <w:rPr>
+          <w:lang w:eastAsia="fr-FR"/>
+        </w:rPr>
+        <w:t xml:space="preserve"> on va additionner les blocs libres consécutif jusqu’à avoir un bloc de taille supérieur ou égale à la taille réel</w:t>
+      </w:r>
+      <w:r>
+        <w:rPr>
+          <w:lang w:eastAsia="fr-FR"/>
+        </w:rPr>
+        <w:t>le</w:t>
+      </w:r>
+      <w:r>
+        <w:rPr>
+          <w:lang w:eastAsia="fr-FR"/>
+        </w:rPr>
+        <w:t xml:space="preserve">. Si on tombe sur un bloc occupé </w:t>
+      </w:r>
+      <w:r>
+        <w:rPr>
+          <w:lang w:eastAsia="fr-FR"/>
+        </w:rPr>
+        <w:t>et</w:t>
+      </w:r>
+      <w:r>
+        <w:rPr>
+          <w:lang w:eastAsia="fr-FR"/>
+        </w:rPr>
+        <w:t xml:space="preserve"> que la taille des bloc</w:t>
+      </w:r>
+      <w:r>
+        <w:rPr>
+          <w:lang w:eastAsia="fr-FR"/>
+        </w:rPr>
+        <w:t>s</w:t>
+      </w:r>
+      <w:r>
+        <w:rPr>
+          <w:lang w:eastAsia="fr-FR"/>
+        </w:rPr>
+        <w:t xml:space="preserve"> fusionné</w:t>
+      </w:r>
+      <w:r>
+        <w:rPr>
+          <w:lang w:eastAsia="fr-FR"/>
+        </w:rPr>
+        <w:t>s</w:t>
+      </w:r>
+      <w:r>
+        <w:rPr>
+          <w:lang w:eastAsia="fr-FR"/>
+        </w:rPr>
+        <w:t xml:space="preserve"> ne suffit pas</w:t>
+      </w:r>
+      <w:r>
+        <w:rPr>
+          <w:lang w:eastAsia="fr-FR"/>
+        </w:rPr>
+        <w:t>,</w:t>
+      </w:r>
+      <w:r>
+        <w:rPr>
+          <w:lang w:eastAsia="fr-FR"/>
+        </w:rPr>
+        <w:t xml:space="preserve"> on remet</w:t>
+      </w:r>
+      <w:r>
+        <w:rPr>
+          <w:lang w:eastAsia="fr-FR"/>
+        </w:rPr>
+        <w:t xml:space="preserve"> cette taille</w:t>
+      </w:r>
+      <w:r>
+        <w:rPr>
+          <w:lang w:eastAsia="fr-FR"/>
+        </w:rPr>
+        <w:t xml:space="preserve"> à 0 et on continue le parcour</w:t>
+      </w:r>
+      <w:r>
+        <w:rPr>
+          <w:lang w:eastAsia="fr-FR"/>
+        </w:rPr>
+        <w:t>s</w:t>
+      </w:r>
+      <w:r>
+        <w:rPr>
+          <w:lang w:eastAsia="fr-FR"/>
+        </w:rPr>
+        <w:t>.</w:t>
       </w:r>
       <w:r>
         <w:rPr>
@@ -312,103 +470,62 @@
         <w:rPr>
           <w:lang w:eastAsia="fr-FR"/>
         </w:rPr>
-        <w:t>la taille demandée plus les 2 octets de métadonnées, arrondie au nombre pair supérieur</w:t>
-      </w:r>
-      <w:r>
-        <w:rPr>
-          <w:lang w:eastAsia="fr-FR"/>
-        </w:rPr>
-        <w:t xml:space="preserve"> (le padding)</w:t>
-      </w:r>
-      <w:r>
-        <w:rPr>
-          <w:lang w:eastAsia="fr-FR"/>
-        </w:rPr>
-        <w:t>.</w:t>
-      </w:r>
-      <w:r>
-        <w:rPr>
-          <w:lang w:eastAsia="fr-FR"/>
-        </w:rPr>
-        <w:t xml:space="preserve"> Ensuite la fonction</w:t>
-      </w:r>
-      <w:r>
-        <w:rPr>
-          <w:lang w:eastAsia="fr-FR"/>
-        </w:rPr>
-        <w:t xml:space="preserve"> parcourt la heap bloc par bloc afin de trouver un bloc suffisamment grand par rapport à la taille demand</w:t>
-      </w:r>
-      <w:r>
-        <w:rPr>
-          <w:lang w:eastAsia="fr-FR"/>
-        </w:rPr>
-        <w:t>ée</w:t>
-      </w:r>
-      <w:r>
-        <w:rPr>
-          <w:lang w:eastAsia="fr-FR"/>
-        </w:rPr>
-        <w:t>. Pour</w:t>
-      </w:r>
-      <w:r>
-        <w:rPr>
-          <w:lang w:eastAsia="fr-FR"/>
-        </w:rPr>
-        <w:t xml:space="preserve"> cela,</w:t>
-      </w:r>
-      <w:r>
-        <w:rPr>
-          <w:lang w:eastAsia="fr-FR"/>
-        </w:rPr>
-        <w:t xml:space="preserve"> on va additionner les blocs libres consécutif jusqu’à avoir un bloc de taille supérieur ou égale à la taille réel qui a été calculée. Si on tombe sur un bloc occupé et que la taille des bloc fusionné ne suffit pas on remet le calcule à 0 et on continue le parcour</w:t>
-      </w:r>
-      <w:r>
-        <w:rPr>
-          <w:lang w:eastAsia="fr-FR"/>
-        </w:rPr>
-        <w:t>s</w:t>
-      </w:r>
-      <w:r>
-        <w:rPr>
-          <w:lang w:eastAsia="fr-FR"/>
-        </w:rPr>
-        <w:t>.</w:t>
-      </w:r>
-      <w:r>
-        <w:rPr>
-          <w:lang w:eastAsia="fr-FR"/>
-        </w:rPr>
-        <w:t xml:space="preserve"> </w:t>
-      </w:r>
-      <w:r>
-        <w:rPr>
-          <w:lang w:eastAsia="fr-FR"/>
-        </w:rPr>
-        <w:t>Si aucun emplacement ne convient</w:t>
-      </w:r>
-      <w:r>
-        <w:rPr>
-          <w:lang w:eastAsia="fr-FR"/>
-        </w:rPr>
-        <w:t xml:space="preserve"> on, o</w:t>
-      </w:r>
-      <w:r>
-        <w:rPr>
-          <w:lang w:eastAsia="fr-FR"/>
-        </w:rPr>
-        <w:t>u si la taille demandée vaut 0, elle renvoie NULL.</w:t>
-      </w:r>
-      <w:r>
-        <w:rPr>
-          <w:lang w:eastAsia="fr-FR"/>
-        </w:rPr>
-        <w:t xml:space="preserve"> Sinon elle met à jour la métadonnée du début du bloc avec sa nouvelle taille et disponibilité, crée une nouvelle métadonnée libre après le bloc </w:t>
-      </w:r>
-      <w:r>
-        <w:rPr>
-          <w:lang w:eastAsia="fr-FR"/>
-        </w:rPr>
-        <w:t>et renvoie un pointeur sur la première case après les métadonnées.</w:t>
+        <w:t xml:space="preserve">Si aucun emplacement ne convient ou si la taille demandée vaut 0, elle renvoie NULL. </w:t>
+      </w:r>
+      <w:r>
+        <w:rPr>
+          <w:lang w:eastAsia="fr-FR"/>
+        </w:rPr>
+        <w:t>Si un bloc respectant les contraintes est trouvé,</w:t>
+      </w:r>
+      <w:r>
+        <w:rPr>
+          <w:lang w:eastAsia="fr-FR"/>
+        </w:rPr>
+        <w:t xml:space="preserve"> elle met à jour la métadonnée du début du bloc avec sa nouvelle taille et </w:t>
+      </w:r>
+      <w:r>
+        <w:rPr>
+          <w:lang w:eastAsia="fr-FR"/>
+        </w:rPr>
+        <w:t xml:space="preserve">la marque </w:t>
+      </w:r>
+      <w:r>
+        <w:rPr>
+          <w:lang w:eastAsia="fr-FR"/>
+        </w:rPr>
+        <w:lastRenderedPageBreak/>
+        <w:t>comme utilisée (bit de poids</w:t>
+      </w:r>
+      <w:r>
+        <w:rPr>
+          <w:lang w:eastAsia="fr-FR"/>
+        </w:rPr>
+        <w:t xml:space="preserve"> le plus</w:t>
+      </w:r>
+      <w:r>
+        <w:rPr>
+          <w:lang w:eastAsia="fr-FR"/>
+        </w:rPr>
+        <w:t xml:space="preserve"> faible à 1)</w:t>
+      </w:r>
+      <w:r>
+        <w:rPr>
+          <w:lang w:eastAsia="fr-FR"/>
+        </w:rPr>
+        <w:t xml:space="preserve">, crée une nouvelle métadonnée libre </w:t>
+      </w:r>
+      <w:r>
+        <w:rPr>
+          <w:lang w:eastAsia="fr-FR"/>
+        </w:rPr>
+        <w:t xml:space="preserve">contenant la taille restante </w:t>
+      </w:r>
+      <w:r>
+        <w:rPr>
+          <w:lang w:eastAsia="fr-FR"/>
+        </w:rPr>
+        <w:t>après le bloc et renvoie un pointeur sur la première case après les métadonnées.</w:t>
       </w:r>
     </w:p>
     <w:p>
@@ -421,11 +538,10 @@
           <w:noProof/>
           <w:lang w:eastAsia="fr-FR"/>
         </w:rPr>
-        <w:lastRenderedPageBreak/>
         <w:drawing>
-          <wp:inline distT="0" distB="0" distL="0" distR="0" wp14:anchorId="31404C57" wp14:editId="7DB00A44">
-            <wp:extent cx="4320000" cy="3518097"/>
-            <wp:effectExtent l="0" t="0" r="4445" b="6350"/>
+          <wp:inline distT="0" distB="0" distL="0" distR="0" wp14:anchorId="31404C57" wp14:editId="501B292A">
+            <wp:extent cx="3398608" cy="2767739"/>
+            <wp:effectExtent l="0" t="0" r="0" b="0"/>
             <wp:docPr id="1413374917" name="Graphique 3"/>
             <wp:cNvGraphicFramePr>
               <a:graphicFrameLocks xmlns:a="http://schemas.openxmlformats.org/drawingml/2006/main" noChangeAspect="1"/>
@@ -452,7 +568,7 @@
                   <pic:spPr>
                     <a:xfrm>
                       <a:off x="0" y="0"/>
-                      <a:ext cx="4320000" cy="3518097"/>
+                      <a:ext cx="3404739" cy="2772732"/>
                     </a:xfrm>
                     <a:prstGeom prst="rect">
                       <a:avLst/>
@@ -467,30 +583,20 @@
     </w:p>
     <w:p>
       <w:pPr>
-        <w:pStyle w:val="Lgende"/>
+        <w:pStyle w:val="Caption"/>
         <w:jc w:val="center"/>
       </w:pPr>
       <w:r>
         <w:t xml:space="preserve">Figure </w:t>
       </w:r>
-      <w:r>
-        <w:fldChar w:fldCharType="begin"/>
-      </w:r>
-      <w:r>
-        <w:instrText xml:space="preserve"> SEQ Figure \* ARABIC </w:instrText>
-      </w:r>
-      <w:r>
-        <w:fldChar w:fldCharType="separate"/>
-      </w:r>
-      <w:r>
-        <w:rPr>
-          <w:noProof/>
-        </w:rPr>
-        <w:t>2</w:t>
-      </w:r>
-      <w:r>
-        <w:fldChar w:fldCharType="end"/>
-      </w:r>
+      <w:fldSimple w:instr=" SEQ Figure \* ARABIC ">
+        <w:r>
+          <w:rPr>
+            <w:noProof/>
+          </w:rPr>
+          <w:t>2</w:t>
+        </w:r>
+      </w:fldSimple>
       <w:r>
         <w:t xml:space="preserve"> - Mémoire après 3 malloc</w:t>
       </w:r>
@@ -517,19 +623,55 @@
         <w:rPr>
           <w:lang w:eastAsia="fr-FR"/>
         </w:rPr>
-        <w:t>-ci seront écrasé</w:t>
-      </w:r>
-      <w:r>
-        <w:rPr>
-          <w:lang w:eastAsia="fr-FR"/>
-        </w:rPr>
-        <w:t>es</w:t>
-      </w:r>
-      <w:r>
-        <w:rPr>
-          <w:lang w:eastAsia="fr-FR"/>
-        </w:rPr>
-        <w:t xml:space="preserve"> lors de leurs prochaine allocation</w:t>
+        <w:t>-</w:t>
+      </w:r>
+      <w:r>
+        <w:rPr>
+          <w:lang w:eastAsia="fr-FR"/>
+        </w:rPr>
+        <w:t xml:space="preserve">ci pourront être écrasées </w:t>
+      </w:r>
+      <w:r>
+        <w:rPr>
+          <w:lang w:eastAsia="fr-FR"/>
+        </w:rPr>
+        <w:t>lors de leurs prochaine</w:t>
+      </w:r>
+      <w:r>
+        <w:rPr>
+          <w:lang w:eastAsia="fr-FR"/>
+        </w:rPr>
+        <w:t>s</w:t>
+      </w:r>
+      <w:r>
+        <w:rPr>
+          <w:lang w:eastAsia="fr-FR"/>
+        </w:rPr>
+        <w:t xml:space="preserve"> allocation</w:t>
+      </w:r>
+      <w:r>
+        <w:rPr>
+          <w:lang w:eastAsia="fr-FR"/>
+        </w:rPr>
+        <w:t>s</w:t>
+      </w:r>
+      <w:r>
+        <w:rPr>
+          <w:lang w:eastAsia="fr-FR"/>
+        </w:rPr>
+        <w:t xml:space="preserve"> et utilisation</w:t>
+      </w:r>
+      <w:r>
+        <w:rPr>
+          <w:lang w:eastAsia="fr-FR"/>
+        </w:rPr>
+        <w:t>s</w:t>
+      </w:r>
+      <w:r>
+        <w:rPr>
+          <w:lang w:eastAsia="fr-FR"/>
+        </w:rPr>
+        <w:t>.</w:t>
       </w:r>
     </w:p>
     <w:p>
@@ -543,9 +685,9 @@
           <w:lang w:eastAsia="fr-FR"/>
         </w:rPr>
         <w:drawing>
-          <wp:inline distT="0" distB="0" distL="0" distR="0" wp14:anchorId="3EC6E6EA" wp14:editId="3EE8EA33">
-            <wp:extent cx="4320000" cy="3511429"/>
-            <wp:effectExtent l="0" t="0" r="4445" b="0"/>
+          <wp:inline distT="0" distB="0" distL="0" distR="0" wp14:anchorId="3EC6E6EA" wp14:editId="3EB93E66">
+            <wp:extent cx="3477891" cy="2826937"/>
+            <wp:effectExtent l="0" t="0" r="8890" b="0"/>
             <wp:docPr id="439122448" name="Graphique 4"/>
             <wp:cNvGraphicFramePr>
               <a:graphicFrameLocks xmlns:a="http://schemas.openxmlformats.org/drawingml/2006/main" noChangeAspect="1"/>
@@ -572,7 +714,7 @@
                   <pic:spPr>
                     <a:xfrm>
                       <a:off x="0" y="0"/>
-                      <a:ext cx="4320000" cy="3511429"/>
+                      <a:ext cx="3487247" cy="2834541"/>
                     </a:xfrm>
                     <a:prstGeom prst="rect">
                       <a:avLst/>
@@ -587,30 +729,20 @@
     </w:p>
     <w:p>
       <w:pPr>
-        <w:pStyle w:val="Lgende"/>
+        <w:pStyle w:val="Caption"/>
         <w:jc w:val="center"/>
       </w:pPr>
       <w:r>
         <w:t xml:space="preserve">Figure </w:t>
       </w:r>
-      <w:r>
-        <w:fldChar w:fldCharType="begin"/>
-      </w:r>
-      <w:r>
-        <w:instrText xml:space="preserve"> SEQ Figure \* ARABIC </w:instrText>
-      </w:r>
-      <w:r>
-        <w:fldChar w:fldCharType="separate"/>
-      </w:r>
-      <w:r>
-        <w:rPr>
-          <w:noProof/>
-        </w:rPr>
-        <w:t>3</w:t>
-      </w:r>
-      <w:r>
-        <w:fldChar w:fldCharType="end"/>
-      </w:r>
+      <w:fldSimple w:instr=" SEQ Figure \* ARABIC ">
+        <w:r>
+          <w:rPr>
+            <w:noProof/>
+          </w:rPr>
+          <w:t>3</w:t>
+        </w:r>
+      </w:fldSimple>
       <w:r>
         <w:t xml:space="preserve"> - Mémoire après le free du bloc de 13 octets</w:t>
       </w:r>
@@ -1077,11 +1209,11 @@
     <w:qFormat/>
     <w:rsid w:val="00A11D2E"/>
   </w:style>
-  <w:style w:type="paragraph" w:styleId="Titre1">
+  <w:style w:type="paragraph" w:styleId="Heading1">
     <w:name w:val="heading 1"/>
     <w:basedOn w:val="Normal"/>
     <w:next w:val="Normal"/>
-    <w:link w:val="Titre1Car"/>
+    <w:link w:val="Heading1Char"/>
     <w:uiPriority w:val="9"/>
     <w:qFormat/>
     <w:rsid w:val="00E2677E"/>
@@ -1098,11 +1230,11 @@
       <w:szCs w:val="40"/>
     </w:rPr>
   </w:style>
-  <w:style w:type="paragraph" w:styleId="Titre2">
+  <w:style w:type="paragraph" w:styleId="Heading2">
     <w:name w:val="heading 2"/>
     <w:basedOn w:val="Normal"/>
     <w:next w:val="Normal"/>
-    <w:link w:val="Titre2Car"/>
+    <w:link w:val="Heading2Char"/>
     <w:uiPriority w:val="9"/>
     <w:semiHidden/>
     <w:unhideWhenUsed/>
@@ -1121,11 +1253,11 @@
       <w:szCs w:val="32"/>
     </w:rPr>
   </w:style>
-  <w:style w:type="paragraph" w:styleId="Titre3">
+  <w:style w:type="paragraph" w:styleId="Heading3">
     <w:name w:val="heading 3"/>
     <w:basedOn w:val="Normal"/>
     <w:next w:val="Normal"/>
-    <w:link w:val="Titre3Car"/>
+    <w:link w:val="Heading3Char"/>
     <w:uiPriority w:val="9"/>
     <w:semiHidden/>
     <w:unhideWhenUsed/>
@@ -1144,11 +1276,11 @@
       <w:szCs w:val="28"/>
     </w:rPr>
   </w:style>
-  <w:style w:type="paragraph" w:styleId="Titre4">
+  <w:style w:type="paragraph" w:styleId="Heading4">
     <w:name w:val="heading 4"/>
     <w:basedOn w:val="Normal"/>
     <w:next w:val="Normal"/>
-    <w:link w:val="Titre4Car"/>
+    <w:link w:val="Heading4Char"/>
     <w:uiPriority w:val="9"/>
     <w:semiHidden/>
     <w:unhideWhenUsed/>
@@ -1167,11 +1299,11 @@
       <w:color w:val="0F4761" w:themeColor="accent1" w:themeShade="BF"/>
     </w:rPr>
   </w:style>
-  <w:style w:type="paragraph" w:styleId="Titre5">
+  <w:style w:type="paragraph" w:styleId="Heading5">
     <w:name w:val="heading 5"/>
     <w:basedOn w:val="Normal"/>
     <w:next w:val="Normal"/>
-    <w:link w:val="Titre5Car"/>
+    <w:link w:val="Heading5Char"/>
     <w:uiPriority w:val="9"/>
     <w:semiHidden/>
     <w:unhideWhenUsed/>
@@ -1188,11 +1320,11 @@
       <w:color w:val="0F4761" w:themeColor="accent1" w:themeShade="BF"/>
     </w:rPr>
   </w:style>
-  <w:style w:type="paragraph" w:styleId="Titre6">
+  <w:style w:type="paragraph" w:styleId="Heading6">
     <w:name w:val="heading 6"/>
     <w:basedOn w:val="Normal"/>
     <w:next w:val="Normal"/>
-    <w:link w:val="Titre6Car"/>
+    <w:link w:val="Heading6Char"/>
     <w:uiPriority w:val="9"/>
     <w:semiHidden/>
     <w:unhideWhenUsed/>
@@ -1211,11 +1343,11 @@
       <w:color w:val="595959" w:themeColor="text1" w:themeTint="A6"/>
     </w:rPr>
   </w:style>
-  <w:style w:type="paragraph" w:styleId="Titre7">
+  <w:style w:type="paragraph" w:styleId="Heading7">
     <w:name w:val="heading 7"/>
     <w:basedOn w:val="Normal"/>
     <w:next w:val="Normal"/>
-    <w:link w:val="Titre7Car"/>
+    <w:link w:val="Heading7Char"/>
     <w:uiPriority w:val="9"/>
     <w:semiHidden/>
     <w:unhideWhenUsed/>
@@ -1232,11 +1364,11 @@
       <w:color w:val="595959" w:themeColor="text1" w:themeTint="A6"/>
     </w:rPr>
   </w:style>
-  <w:style w:type="paragraph" w:styleId="Titre8">
+  <w:style w:type="paragraph" w:styleId="Heading8">
     <w:name w:val="heading 8"/>
     <w:basedOn w:val="Normal"/>
     <w:next w:val="Normal"/>
-    <w:link w:val="Titre8Car"/>
+    <w:link w:val="Heading8Char"/>
     <w:uiPriority w:val="9"/>
     <w:semiHidden/>
     <w:unhideWhenUsed/>
@@ -1255,11 +1387,11 @@
       <w:color w:val="272727" w:themeColor="text1" w:themeTint="D8"/>
     </w:rPr>
   </w:style>
-  <w:style w:type="paragraph" w:styleId="Titre9">
+  <w:style w:type="paragraph" w:styleId="Heading9">
     <w:name w:val="heading 9"/>
     <w:basedOn w:val="Normal"/>
     <w:next w:val="Normal"/>
-    <w:link w:val="Titre9Car"/>
+    <w:link w:val="Heading9Char"/>
     <w:uiPriority w:val="9"/>
     <w:semiHidden/>
     <w:unhideWhenUsed/>
@@ -1276,13 +1408,13 @@
       <w:color w:val="272727" w:themeColor="text1" w:themeTint="D8"/>
     </w:rPr>
   </w:style>
-  <w:style w:type="character" w:default="1" w:styleId="Policepardfaut">
+  <w:style w:type="character" w:default="1" w:styleId="DefaultParagraphFont">
     <w:name w:val="Default Paragraph Font"/>
     <w:uiPriority w:val="1"/>
     <w:semiHidden/>
     <w:unhideWhenUsed/>
   </w:style>
-  <w:style w:type="table" w:default="1" w:styleId="TableauNormal">
+  <w:style w:type="table" w:default="1" w:styleId="TableNormal">
     <w:name w:val="Normal Table"/>
     <w:uiPriority w:val="99"/>
     <w:semiHidden/>
@@ -1297,16 +1429,16 @@
       </w:tblCellMar>
     </w:tblPr>
   </w:style>
-  <w:style w:type="numbering" w:default="1" w:styleId="Aucuneliste">
+  <w:style w:type="numbering" w:default="1" w:styleId="NoList">
     <w:name w:val="No List"/>
     <w:uiPriority w:val="99"/>
     <w:semiHidden/>
     <w:unhideWhenUsed/>
   </w:style>
-  <w:style w:type="character" w:customStyle="1" w:styleId="Titre1Car">
-    <w:name w:val="Titre 1 Car"/>
-    <w:basedOn w:val="Policepardfaut"/>
-    <w:link w:val="Titre1"/>
+  <w:style w:type="character" w:customStyle="1" w:styleId="Heading1Char">
+    <w:name w:val="Heading 1 Char"/>
+    <w:basedOn w:val="DefaultParagraphFont"/>
+    <w:link w:val="Heading1"/>
     <w:uiPriority w:val="9"/>
     <w:rsid w:val="00E2677E"/>
     <w:rPr>
@@ -1316,10 +1448,10 @@
       <w:szCs w:val="40"/>
     </w:rPr>
   </w:style>
-  <w:style w:type="character" w:customStyle="1" w:styleId="Titre2Car">
-    <w:name w:val="Titre 2 Car"/>
-    <w:basedOn w:val="Policepardfaut"/>
-    <w:link w:val="Titre2"/>
+  <w:style w:type="character" w:customStyle="1" w:styleId="Heading2Char">
+    <w:name w:val="Heading 2 Char"/>
+    <w:basedOn w:val="DefaultParagraphFont"/>
+    <w:link w:val="Heading2"/>
     <w:uiPriority w:val="9"/>
     <w:semiHidden/>
     <w:rsid w:val="00E2677E"/>
@@ -1330,10 +1462,10 @@
       <w:szCs w:val="32"/>
     </w:rPr>
   </w:style>
-  <w:style w:type="character" w:customStyle="1" w:styleId="Titre3Car">
-    <w:name w:val="Titre 3 Car"/>
-    <w:basedOn w:val="Policepardfaut"/>
-    <w:link w:val="Titre3"/>
+  <w:style w:type="character" w:customStyle="1" w:styleId="Heading3Char">
+    <w:name w:val="Heading 3 Char"/>
+    <w:basedOn w:val="DefaultParagraphFont"/>
+    <w:link w:val="Heading3"/>
     <w:uiPriority w:val="9"/>
     <w:semiHidden/>
     <w:rsid w:val="00E2677E"/>
@@ -1344,10 +1476,10 @@
       <w:szCs w:val="28"/>
     </w:rPr>
   </w:style>
-  <w:style w:type="character" w:customStyle="1" w:styleId="Titre4Car">
-    <w:name w:val="Titre 4 Car"/>
-    <w:basedOn w:val="Policepardfaut"/>
-    <w:link w:val="Titre4"/>
+  <w:style w:type="character" w:customStyle="1" w:styleId="Heading4Char">
+    <w:name w:val="Heading 4 Char"/>
+    <w:basedOn w:val="DefaultParagraphFont"/>
+    <w:link w:val="Heading4"/>
     <w:uiPriority w:val="9"/>
     <w:semiHidden/>
     <w:rsid w:val="00E2677E"/>
@@ -1358,10 +1490,10 @@
       <w:color w:val="0F4761" w:themeColor="accent1" w:themeShade="BF"/>
     </w:rPr>
   </w:style>
-  <w:style w:type="character" w:customStyle="1" w:styleId="Titre5Car">
-    <w:name w:val="Titre 5 Car"/>
-    <w:basedOn w:val="Policepardfaut"/>
-    <w:link w:val="Titre5"/>
+  <w:style w:type="character" w:customStyle="1" w:styleId="Heading5Char">
+    <w:name w:val="Heading 5 Char"/>
+    <w:basedOn w:val="DefaultParagraphFont"/>
+    <w:link w:val="Heading5"/>
     <w:uiPriority w:val="9"/>
     <w:semiHidden/>
     <w:rsid w:val="00E2677E"/>
@@ -1370,10 +1502,10 @@
       <w:color w:val="0F4761" w:themeColor="accent1" w:themeShade="BF"/>
     </w:rPr>
   </w:style>
-  <w:style w:type="character" w:customStyle="1" w:styleId="Titre6Car">
-    <w:name w:val="Titre 6 Car"/>
-    <w:basedOn w:val="Policepardfaut"/>
-    <w:link w:val="Titre6"/>
+  <w:style w:type="character" w:customStyle="1" w:styleId="Heading6Char">
+    <w:name w:val="Heading 6 Char"/>
+    <w:basedOn w:val="DefaultParagraphFont"/>
+    <w:link w:val="Heading6"/>
     <w:uiPriority w:val="9"/>
     <w:semiHidden/>
     <w:rsid w:val="00E2677E"/>
@@ -1384,10 +1516,10 @@
       <w:color w:val="595959" w:themeColor="text1" w:themeTint="A6"/>
     </w:rPr>
   </w:style>
-  <w:style w:type="character" w:customStyle="1" w:styleId="Titre7Car">
-    <w:name w:val="Titre 7 Car"/>
-    <w:basedOn w:val="Policepardfaut"/>
-    <w:link w:val="Titre7"/>
+  <w:style w:type="character" w:customStyle="1" w:styleId="Heading7Char">
+    <w:name w:val="Heading 7 Char"/>
+    <w:basedOn w:val="DefaultParagraphFont"/>
+    <w:link w:val="Heading7"/>
     <w:uiPriority w:val="9"/>
     <w:semiHidden/>
     <w:rsid w:val="00E2677E"/>
@@ -1396,10 +1528,10 @@
       <w:color w:val="595959" w:themeColor="text1" w:themeTint="A6"/>
     </w:rPr>
   </w:style>
-  <w:style w:type="character" w:customStyle="1" w:styleId="Titre8Car">
-    <w:name w:val="Titre 8 Car"/>
-    <w:basedOn w:val="Policepardfaut"/>
-    <w:link w:val="Titre8"/>
+  <w:style w:type="character" w:customStyle="1" w:styleId="Heading8Char">
+    <w:name w:val="Heading 8 Char"/>
+    <w:basedOn w:val="DefaultParagraphFont"/>
+    <w:link w:val="Heading8"/>
     <w:uiPriority w:val="9"/>
     <w:semiHidden/>
     <w:rsid w:val="00E2677E"/>
@@ -1410,10 +1542,10 @@
       <w:color w:val="272727" w:themeColor="text1" w:themeTint="D8"/>
     </w:rPr>
   </w:style>
-  <w:style w:type="character" w:customStyle="1" w:styleId="Titre9Car">
-    <w:name w:val="Titre 9 Car"/>
-    <w:basedOn w:val="Policepardfaut"/>
-    <w:link w:val="Titre9"/>
+  <w:style w:type="character" w:customStyle="1" w:styleId="Heading9Char">
+    <w:name w:val="Heading 9 Char"/>
+    <w:basedOn w:val="DefaultParagraphFont"/>
+    <w:link w:val="Heading9"/>
     <w:uiPriority w:val="9"/>
     <w:semiHidden/>
     <w:rsid w:val="00E2677E"/>
@@ -1422,11 +1554,11 @@
       <w:color w:val="272727" w:themeColor="text1" w:themeTint="D8"/>
     </w:rPr>
   </w:style>
-  <w:style w:type="paragraph" w:styleId="Titre">
+  <w:style w:type="paragraph" w:styleId="Title">
     <w:name w:val="Title"/>
     <w:basedOn w:val="Normal"/>
     <w:next w:val="Normal"/>
-    <w:link w:val="TitreCar"/>
+    <w:link w:val="TitleChar"/>
     <w:uiPriority w:val="10"/>
     <w:qFormat/>
     <w:rsid w:val="00E2677E"/>
@@ -1442,10 +1574,10 @@
       <w:szCs w:val="56"/>
     </w:rPr>
   </w:style>
-  <w:style w:type="character" w:customStyle="1" w:styleId="TitreCar">
-    <w:name w:val="Titre Car"/>
-    <w:basedOn w:val="Policepardfaut"/>
-    <w:link w:val="Titre"/>
+  <w:style w:type="character" w:customStyle="1" w:styleId="TitleChar">
+    <w:name w:val="Title Char"/>
+    <w:basedOn w:val="DefaultParagraphFont"/>
+    <w:link w:val="Title"/>
     <w:uiPriority w:val="10"/>
     <w:rsid w:val="00E2677E"/>
     <w:rPr>
@@ -1456,11 +1588,11 @@
       <w:szCs w:val="56"/>
     </w:rPr>
   </w:style>
-  <w:style w:type="paragraph" w:styleId="Sous-titre">
+  <w:style w:type="paragraph" w:styleId="Subtitle">
     <w:name w:val="Subtitle"/>
     <w:basedOn w:val="Normal"/>
     <w:next w:val="Normal"/>
-    <w:link w:val="Sous-titreCar"/>
+    <w:link w:val="SubtitleChar"/>
     <w:uiPriority w:val="11"/>
     <w:qFormat/>
     <w:rsid w:val="00E2677E"/>
@@ -1477,10 +1609,10 @@
       <w:szCs w:val="28"/>
     </w:rPr>
   </w:style>
-  <w:style w:type="character" w:customStyle="1" w:styleId="Sous-titreCar">
-    <w:name w:val="Sous-titre Car"/>
-    <w:basedOn w:val="Policepardfaut"/>
-    <w:link w:val="Sous-titre"/>
+  <w:style w:type="character" w:customStyle="1" w:styleId="SubtitleChar">
+    <w:name w:val="Subtitle Char"/>
+    <w:basedOn w:val="DefaultParagraphFont"/>
+    <w:link w:val="Subtitle"/>
     <w:uiPriority w:val="11"/>
     <w:rsid w:val="00E2677E"/>
     <w:rPr>
@@ -1491,11 +1623,11 @@
       <w:szCs w:val="28"/>
     </w:rPr>
   </w:style>
-  <w:style w:type="paragraph" w:styleId="Citation">
+  <w:style w:type="paragraph" w:styleId="Quote">
     <w:name w:val="Quote"/>
     <w:basedOn w:val="Normal"/>
     <w:next w:val="Normal"/>
-    <w:link w:val="CitationCar"/>
+    <w:link w:val="QuoteChar"/>
     <w:uiPriority w:val="29"/>
     <w:qFormat/>
     <w:rsid w:val="00E2677E"/>
@@ -1509,10 +1641,10 @@
       <w:color w:val="404040" w:themeColor="text1" w:themeTint="BF"/>
     </w:rPr>
   </w:style>
-  <w:style w:type="character" w:customStyle="1" w:styleId="CitationCar">
-    <w:name w:val="Citation Car"/>
-    <w:basedOn w:val="Policepardfaut"/>
-    <w:link w:val="Citation"/>
+  <w:style w:type="character" w:customStyle="1" w:styleId="QuoteChar">
+    <w:name w:val="Quote Char"/>
+    <w:basedOn w:val="DefaultParagraphFont"/>
+    <w:link w:val="Quote"/>
     <w:uiPriority w:val="29"/>
     <w:rsid w:val="00E2677E"/>
     <w:rPr>
@@ -1521,7 +1653,7 @@
       <w:color w:val="404040" w:themeColor="text1" w:themeTint="BF"/>
     </w:rPr>
   </w:style>
-  <w:style w:type="paragraph" w:styleId="Paragraphedeliste">
+  <w:style w:type="paragraph" w:styleId="ListParagraph">
     <w:name w:val="List Paragraph"/>
     <w:basedOn w:val="Normal"/>
     <w:uiPriority w:val="34"/>
@@ -1532,9 +1664,9 @@
       <w:contextualSpacing/>
     </w:pPr>
   </w:style>
-  <w:style w:type="character" w:styleId="Accentuationintense">
+  <w:style w:type="character" w:styleId="IntenseEmphasis">
     <w:name w:val="Intense Emphasis"/>
-    <w:basedOn w:val="Policepardfaut"/>
+    <w:basedOn w:val="DefaultParagraphFont"/>
     <w:uiPriority w:val="21"/>
     <w:qFormat/>
     <w:rsid w:val="00E2677E"/>
@@ -1544,11 +1676,11 @@
       <w:color w:val="0F4761" w:themeColor="accent1" w:themeShade="BF"/>
     </w:rPr>
   </w:style>
-  <w:style w:type="paragraph" w:styleId="Citationintense">
+  <w:style w:type="paragraph" w:styleId="IntenseQuote">
     <w:name w:val="Intense Quote"/>
     <w:basedOn w:val="Normal"/>
     <w:next w:val="Normal"/>
-    <w:link w:val="CitationintenseCar"/>
+    <w:link w:val="IntenseQuoteChar"/>
     <w:uiPriority w:val="30"/>
     <w:qFormat/>
     <w:rsid w:val="00E2677E"/>
@@ -1567,10 +1699,10 @@
       <w:color w:val="0F4761" w:themeColor="accent1" w:themeShade="BF"/>
     </w:rPr>
   </w:style>
-  <w:style w:type="character" w:customStyle="1" w:styleId="CitationintenseCar">
-    <w:name w:val="Citation intense Car"/>
-    <w:basedOn w:val="Policepardfaut"/>
-    <w:link w:val="Citationintense"/>
+  <w:style w:type="character" w:customStyle="1" w:styleId="IntenseQuoteChar">
+    <w:name w:val="Intense Quote Char"/>
+    <w:basedOn w:val="DefaultParagraphFont"/>
+    <w:link w:val="IntenseQuote"/>
     <w:uiPriority w:val="30"/>
     <w:rsid w:val="00E2677E"/>
     <w:rPr>
@@ -1579,9 +1711,9 @@
       <w:color w:val="0F4761" w:themeColor="accent1" w:themeShade="BF"/>
     </w:rPr>
   </w:style>
-  <w:style w:type="character" w:styleId="Rfrenceintense">
+  <w:style w:type="character" w:styleId="IntenseReference">
     <w:name w:val="Intense Reference"/>
-    <w:basedOn w:val="Policepardfaut"/>
+    <w:basedOn w:val="DefaultParagraphFont"/>
     <w:uiPriority w:val="32"/>
     <w:qFormat/>
     <w:rsid w:val="00E2677E"/>
@@ -1593,7 +1725,7 @@
       <w:spacing w:val="5"/>
     </w:rPr>
   </w:style>
-  <w:style w:type="paragraph" w:styleId="Lgende">
+  <w:style w:type="paragraph" w:styleId="Caption">
     <w:name w:val="caption"/>
     <w:basedOn w:val="Normal"/>
     <w:next w:val="Normal"/>
@@ -1612,10 +1744,10 @@
       <w:szCs w:val="18"/>
     </w:rPr>
   </w:style>
-  <w:style w:type="paragraph" w:styleId="En-tte">
+  <w:style w:type="paragraph" w:styleId="Header">
     <w:name w:val="header"/>
     <w:basedOn w:val="Normal"/>
-    <w:link w:val="En-tteCar"/>
+    <w:link w:val="HeaderChar"/>
     <w:uiPriority w:val="99"/>
     <w:unhideWhenUsed/>
     <w:rsid w:val="00BE501A"/>
@@ -1627,17 +1759,17 @@
       <w:spacing w:after="0" w:line="240" w:lineRule="auto"/>
     </w:pPr>
   </w:style>
-  <w:style w:type="character" w:customStyle="1" w:styleId="En-tteCar">
-    <w:name w:val="En-tête Car"/>
-    <w:basedOn w:val="Policepardfaut"/>
-    <w:link w:val="En-tte"/>
+  <w:style w:type="character" w:customStyle="1" w:styleId="HeaderChar">
+    <w:name w:val="Header Char"/>
+    <w:basedOn w:val="DefaultParagraphFont"/>
+    <w:link w:val="Header"/>
     <w:uiPriority w:val="99"/>
     <w:rsid w:val="00BE501A"/>
   </w:style>
-  <w:style w:type="paragraph" w:styleId="Pieddepage">
+  <w:style w:type="paragraph" w:styleId="Footer">
     <w:name w:val="footer"/>
     <w:basedOn w:val="Normal"/>
-    <w:link w:val="PieddepageCar"/>
+    <w:link w:val="FooterChar"/>
     <w:uiPriority w:val="99"/>
     <w:unhideWhenUsed/>
     <w:rsid w:val="00BE501A"/>
@@ -1649,10 +1781,10 @@
       <w:spacing w:after="0" w:line="240" w:lineRule="auto"/>
     </w:pPr>
   </w:style>
-  <w:style w:type="character" w:customStyle="1" w:styleId="PieddepageCar">
-    <w:name w:val="Pied de page Car"/>
-    <w:basedOn w:val="Policepardfaut"/>
-    <w:link w:val="Pieddepage"/>
+  <w:style w:type="character" w:customStyle="1" w:styleId="FooterChar">
+    <w:name w:val="Footer Char"/>
+    <w:basedOn w:val="DefaultParagraphFont"/>
+    <w:link w:val="Footer"/>
     <w:uiPriority w:val="99"/>
     <w:rsid w:val="00BE501A"/>
   </w:style>

</xml_diff>

<commit_message>
Added "Amélioratoins" section in written repport
</commit_message>
<xml_diff>
--- a/Rapport malloc et free groupe 17.docx
+++ b/Rapport malloc et free groupe 17.docx
@@ -77,19 +77,7 @@
         <w:rPr>
           <w:lang w:eastAsia="fr-FR"/>
         </w:rPr>
-        <w:t xml:space="preserve"> Ceci est nécessaire parce que </w:t>
-      </w:r>
-      <w:r>
-        <w:rPr>
-          <w:lang w:eastAsia="fr-FR"/>
-        </w:rPr>
-        <w:t>le type uint8_t est limité à 8 bits, ne permettant de représenter des nombres entiers n’allant que jusqu’à 255.</w:t>
-      </w:r>
-      <w:r>
-        <w:rPr>
-          <w:lang w:eastAsia="fr-FR"/>
-        </w:rPr>
-        <w:t xml:space="preserve"> En en mettant 2 </w:t>
+        <w:t xml:space="preserve"> Ceci est nécessaire parce que le type uint8_t est limité à 8 bits, ne permettant de représenter des nombres entiers n’allant que jusqu’à 255. En en mettant 2 </w:t>
       </w:r>
       <w:r>
         <w:rPr>
@@ -298,14 +286,27 @@
       <w:r>
         <w:t xml:space="preserve">Figure </w:t>
       </w:r>
-      <w:fldSimple w:instr=" SEQ Figure \* ARABIC ">
-        <w:r>
-          <w:rPr>
-            <w:noProof/>
-          </w:rPr>
-          <w:t>1</w:t>
-        </w:r>
-      </w:fldSimple>
+      <w:r>
+        <w:fldChar w:fldCharType="begin"/>
+      </w:r>
+      <w:r>
+        <w:instrText xml:space="preserve"> SEQ Figure \* ARABIC </w:instrText>
+      </w:r>
+      <w:r>
+        <w:fldChar w:fldCharType="separate"/>
+      </w:r>
+      <w:r>
+        <w:rPr>
+          <w:noProof/>
+        </w:rPr>
+        <w:t>1</w:t>
+      </w:r>
+      <w:r>
+        <w:rPr>
+          <w:noProof/>
+        </w:rPr>
+        <w:fldChar w:fldCharType="end"/>
+      </w:r>
       <w:r>
         <w:t xml:space="preserve"> </w:t>
       </w:r>
@@ -326,13 +327,39 @@
         <w:rPr>
           <w:lang w:eastAsia="fr-FR"/>
         </w:rPr>
-        <w:t xml:space="preserve">Au niveau algorithmique, my_malloc commence par calculer la taille réelle qui va être nécessaire sur base de la taille demandée à laquelle on ajoute 2, pour les octets de métadonnées et </w:t>
-      </w:r>
-      <w:r>
-        <w:rPr>
-          <w:lang w:eastAsia="fr-FR"/>
-        </w:rPr>
-        <w:t>qu’on arrondit au nombre pair suppérieur pour toujours avoir une taille paire et que le bit de poids le plus faible puisse toujours servir de flag.</w:t>
+        <w:t xml:space="preserve">Au niveau algorithmique, </w:t>
+      </w:r>
+      <w:r>
+        <w:rPr>
+          <w:b/>
+          <w:bCs/>
+          <w:lang w:eastAsia="fr-FR"/>
+        </w:rPr>
+        <w:t>my_malloc</w:t>
+      </w:r>
+      <w:r>
+        <w:rPr>
+          <w:lang w:eastAsia="fr-FR"/>
+        </w:rPr>
+        <w:t xml:space="preserve"> commence par calculer la taille réelle qui va être nécessaire sur base de la taille demandée à laquelle on ajoute 2, pour les octets de métadonnées et </w:t>
+      </w:r>
+      <w:r>
+        <w:rPr>
+          <w:lang w:eastAsia="fr-FR"/>
+        </w:rPr>
+        <w:t xml:space="preserve">qu’on arrondit au nombre pair </w:t>
+      </w:r>
+      <w:r>
+        <w:rPr>
+          <w:lang w:eastAsia="fr-FR"/>
+        </w:rPr>
+        <w:t>supérieur</w:t>
+      </w:r>
+      <w:r>
+        <w:rPr>
+          <w:lang w:eastAsia="fr-FR"/>
+        </w:rPr>
+        <w:t xml:space="preserve"> pour toujours avoir une taille paire et que le bit de poids le plus faible puisse toujours servir de flag.</w:t>
       </w:r>
       <w:r>
         <w:rPr>
@@ -589,14 +616,27 @@
       <w:r>
         <w:t xml:space="preserve">Figure </w:t>
       </w:r>
-      <w:fldSimple w:instr=" SEQ Figure \* ARABIC ">
-        <w:r>
-          <w:rPr>
-            <w:noProof/>
-          </w:rPr>
-          <w:t>2</w:t>
-        </w:r>
-      </w:fldSimple>
+      <w:r>
+        <w:fldChar w:fldCharType="begin"/>
+      </w:r>
+      <w:r>
+        <w:instrText xml:space="preserve"> SEQ Figure \* ARABIC </w:instrText>
+      </w:r>
+      <w:r>
+        <w:fldChar w:fldCharType="separate"/>
+      </w:r>
+      <w:r>
+        <w:rPr>
+          <w:noProof/>
+        </w:rPr>
+        <w:t>2</w:t>
+      </w:r>
+      <w:r>
+        <w:rPr>
+          <w:noProof/>
+        </w:rPr>
+        <w:fldChar w:fldCharType="end"/>
+      </w:r>
       <w:r>
         <w:t xml:space="preserve"> - Mémoire après 3 malloc</w:t>
       </w:r>
@@ -611,7 +651,21 @@
         <w:rPr>
           <w:lang w:eastAsia="fr-FR"/>
         </w:rPr>
-        <w:t>La fonction my_free reçoit ce pointeur, recule d'une case pour retrouver le second octet de métadonnées et met son bit de poids faible à 0. Si le pointeur est NULL, elle ne fait rien. On n’efface pas les éventuelles données qui sont écrite dans la heap, celle</w:t>
+        <w:t xml:space="preserve">La fonction </w:t>
+      </w:r>
+      <w:r>
+        <w:rPr>
+          <w:b/>
+          <w:bCs/>
+          <w:lang w:eastAsia="fr-FR"/>
+        </w:rPr>
+        <w:t>my_free</w:t>
+      </w:r>
+      <w:r>
+        <w:rPr>
+          <w:lang w:eastAsia="fr-FR"/>
+        </w:rPr>
+        <w:t xml:space="preserve"> reçoit ce pointeur, recule d'une case pour retrouver le second octet de métadonnées et met son bit de poids faible à 0. Si le pointeur est NULL, elle ne fait rien. On n’efface pas les éventuelles données qui sont écrite dans la heap, celle</w:t>
       </w:r>
       <w:r>
         <w:rPr>
@@ -735,16 +789,93 @@
       <w:r>
         <w:t xml:space="preserve">Figure </w:t>
       </w:r>
-      <w:fldSimple w:instr=" SEQ Figure \* ARABIC ">
-        <w:r>
-          <w:rPr>
-            <w:noProof/>
-          </w:rPr>
-          <w:t>3</w:t>
-        </w:r>
-      </w:fldSimple>
+      <w:r>
+        <w:fldChar w:fldCharType="begin"/>
+      </w:r>
+      <w:r>
+        <w:instrText xml:space="preserve"> SEQ Figure \* ARABIC </w:instrText>
+      </w:r>
+      <w:r>
+        <w:fldChar w:fldCharType="separate"/>
+      </w:r>
+      <w:r>
+        <w:rPr>
+          <w:noProof/>
+        </w:rPr>
+        <w:t>3</w:t>
+      </w:r>
+      <w:r>
+        <w:rPr>
+          <w:noProof/>
+        </w:rPr>
+        <w:fldChar w:fldCharType="end"/>
+      </w:r>
       <w:r>
         <w:t xml:space="preserve"> - Mémoire après le free du bloc de 13 octets</w:t>
+      </w:r>
+    </w:p>
+    <w:p>
+      <w:pPr>
+        <w:rPr>
+          <w:b/>
+          <w:bCs/>
+        </w:rPr>
+      </w:pPr>
+      <w:r>
+        <w:rPr>
+          <w:b/>
+          <w:bCs/>
+        </w:rPr>
+        <w:t>Améliorations :</w:t>
+      </w:r>
+      <w:r>
+        <w:rPr>
+          <w:b/>
+          <w:bCs/>
+        </w:rPr>
+        <w:t xml:space="preserve"> </w:t>
+      </w:r>
+      <w:r>
+        <w:t>Nous avions</w:t>
+      </w:r>
+      <w:r>
+        <w:t xml:space="preserve"> commencé en n'utilisant qu'un octet pour les métadonnées, ne permettant que des blocs </w:t>
+      </w:r>
+      <w:r>
+        <w:t xml:space="preserve">d’une longueur de 250 maximum (pour avoir 256 blocs disponibles) </w:t>
+      </w:r>
+      <w:r>
+        <w:t>mais cette version ne passait pas l</w:t>
+      </w:r>
+      <w:r>
+        <w:t xml:space="preserve">’entièreté des </w:t>
+      </w:r>
+      <w:r>
+        <w:t>tests</w:t>
+      </w:r>
+      <w:r>
+        <w:t xml:space="preserve"> Inginious (</w:t>
+      </w:r>
+      <w:r>
+        <w:rPr>
+          <w:lang w:val="en-BE"/>
+        </w:rPr>
+        <w:t>Test : my_malloc() et my_free() de gros blocs</w:t>
+      </w:r>
+      <w:r>
+        <w:t>)</w:t>
+      </w:r>
+      <w:r>
+        <w:t xml:space="preserve">. Cette version-ci est </w:t>
+      </w:r>
+      <w:r>
+        <w:t>une amélioration</w:t>
+      </w:r>
+      <w:r>
+        <w:t xml:space="preserve"> de la première</w:t>
+      </w:r>
+      <w:r>
+        <w:t xml:space="preserve"> pour résoudre le problème</w:t>
       </w:r>
     </w:p>
     <w:sectPr>
@@ -1411,7 +1542,6 @@
   <w:style w:type="character" w:default="1" w:styleId="DefaultParagraphFont">
     <w:name w:val="Default Paragraph Font"/>
     <w:uiPriority w:val="1"/>
-    <w:semiHidden/>
     <w:unhideWhenUsed/>
   </w:style>
   <w:style w:type="table" w:default="1" w:styleId="TableNormal">

</xml_diff>

<commit_message>
Last changes to written report for submition
</commit_message>
<xml_diff>
--- a/Rapport malloc et free groupe 17.docx
+++ b/Rapport malloc et free groupe 17.docx
@@ -4,12 +4,9 @@
   <w:body>
     <w:p>
       <w:pPr>
-        <w:jc w:val="center"/>
         <w:rPr>
           <w:b/>
           <w:bCs/>
-          <w:sz w:val="44"/>
-          <w:szCs w:val="44"/>
           <w:lang w:eastAsia="fr-FR"/>
         </w:rPr>
       </w:pPr>
@@ -17,11 +14,17 @@
         <w:rPr>
           <w:b/>
           <w:bCs/>
-          <w:sz w:val="44"/>
-          <w:szCs w:val="44"/>
-          <w:lang w:eastAsia="fr-FR"/>
-        </w:rPr>
-        <w:t>Fonctionnement de my_malloc et my_free</w:t>
+          <w:lang w:eastAsia="fr-FR"/>
+        </w:rPr>
+        <w:t xml:space="preserve">Julien Locht 73972600 et Mathias Van der Cuylen </w:t>
+      </w:r>
+      <w:r>
+        <w:rPr>
+          <w:b/>
+          <w:bCs/>
+          <w:lang w:eastAsia="fr-FR"/>
+        </w:rPr>
+        <w:t>67302600</w:t>
       </w:r>
     </w:p>
     <w:p>
@@ -34,7 +37,63 @@
         <w:rPr>
           <w:lang w:eastAsia="fr-FR"/>
         </w:rPr>
-        <w:t>Pour réaliser my_malloc et my_free, on utilise un tableau de uint8_t de 64000 cases afin de simuler une heap de 64000 octets. Cette heap est divisée en blocs contigus, libres ou occupés.</w:t>
+        <w:t xml:space="preserve">Pour réaliser </w:t>
+      </w:r>
+      <w:proofErr w:type="spellStart"/>
+      <w:r>
+        <w:rPr>
+          <w:lang w:eastAsia="fr-FR"/>
+        </w:rPr>
+        <w:t>my_malloc</w:t>
+      </w:r>
+      <w:proofErr w:type="spellEnd"/>
+      <w:r>
+        <w:rPr>
+          <w:lang w:eastAsia="fr-FR"/>
+        </w:rPr>
+        <w:t xml:space="preserve"> et </w:t>
+      </w:r>
+      <w:proofErr w:type="spellStart"/>
+      <w:r>
+        <w:rPr>
+          <w:lang w:eastAsia="fr-FR"/>
+        </w:rPr>
+        <w:t>my_free</w:t>
+      </w:r>
+      <w:proofErr w:type="spellEnd"/>
+      <w:r>
+        <w:rPr>
+          <w:lang w:eastAsia="fr-FR"/>
+        </w:rPr>
+        <w:t xml:space="preserve">, on utilise un tableau de uint8_t de 64000 cases afin de simuler une </w:t>
+      </w:r>
+      <w:proofErr w:type="spellStart"/>
+      <w:r>
+        <w:rPr>
+          <w:lang w:eastAsia="fr-FR"/>
+        </w:rPr>
+        <w:t>heap</w:t>
+      </w:r>
+      <w:proofErr w:type="spellEnd"/>
+      <w:r>
+        <w:rPr>
+          <w:lang w:eastAsia="fr-FR"/>
+        </w:rPr>
+        <w:t xml:space="preserve"> de 64000 octets. Cette </w:t>
+      </w:r>
+      <w:proofErr w:type="spellStart"/>
+      <w:r>
+        <w:rPr>
+          <w:lang w:eastAsia="fr-FR"/>
+        </w:rPr>
+        <w:t>heap</w:t>
+      </w:r>
+      <w:proofErr w:type="spellEnd"/>
+      <w:r>
+        <w:rPr>
+          <w:lang w:eastAsia="fr-FR"/>
+        </w:rPr>
+        <w:t xml:space="preserve"> est divisée en blocs contigus, libres ou occupés.</w:t>
       </w:r>
     </w:p>
     <w:p>
@@ -113,7 +172,21 @@
         <w:rPr>
           <w:lang w:eastAsia="fr-FR"/>
         </w:rPr>
-        <w:t>, ce qui permet de représenter l’entièreté de la heap vide (64000)</w:t>
+        <w:t xml:space="preserve">, ce qui permet de représenter l’entièreté de la </w:t>
+      </w:r>
+      <w:proofErr w:type="spellStart"/>
+      <w:r>
+        <w:rPr>
+          <w:lang w:eastAsia="fr-FR"/>
+        </w:rPr>
+        <w:t>heap</w:t>
+      </w:r>
+      <w:proofErr w:type="spellEnd"/>
+      <w:r>
+        <w:rPr>
+          <w:lang w:eastAsia="fr-FR"/>
+        </w:rPr>
+        <w:t xml:space="preserve"> vide (64000)</w:t>
       </w:r>
       <w:r>
         <w:rPr>
@@ -138,7 +211,21 @@
         <w:rPr>
           <w:lang w:eastAsia="fr-FR"/>
         </w:rPr>
-        <w:t xml:space="preserve"> grâce au padding de 2 utilisé</w:t>
+        <w:t xml:space="preserve"> grâce au </w:t>
+      </w:r>
+      <w:proofErr w:type="spellStart"/>
+      <w:r>
+        <w:rPr>
+          <w:lang w:eastAsia="fr-FR"/>
+        </w:rPr>
+        <w:t>padding</w:t>
+      </w:r>
+      <w:proofErr w:type="spellEnd"/>
+      <w:r>
+        <w:rPr>
+          <w:lang w:eastAsia="fr-FR"/>
+        </w:rPr>
+        <w:t xml:space="preserve"> de 2 utilisé</w:t>
       </w:r>
       <w:r>
         <w:rPr>
@@ -286,27 +373,14 @@
       <w:r>
         <w:t xml:space="preserve">Figure </w:t>
       </w:r>
-      <w:r>
-        <w:fldChar w:fldCharType="begin"/>
-      </w:r>
-      <w:r>
-        <w:instrText xml:space="preserve"> SEQ Figure \* ARABIC </w:instrText>
-      </w:r>
-      <w:r>
-        <w:fldChar w:fldCharType="separate"/>
-      </w:r>
-      <w:r>
-        <w:rPr>
-          <w:noProof/>
-        </w:rPr>
-        <w:t>1</w:t>
-      </w:r>
-      <w:r>
-        <w:rPr>
-          <w:noProof/>
-        </w:rPr>
-        <w:fldChar w:fldCharType="end"/>
-      </w:r>
+      <w:fldSimple w:instr=" SEQ Figure \* ARABIC ">
+        <w:r>
+          <w:rPr>
+            <w:noProof/>
+          </w:rPr>
+          <w:t>1</w:t>
+        </w:r>
+      </w:fldSimple>
       <w:r>
         <w:t xml:space="preserve"> </w:t>
       </w:r>
@@ -329,6 +403,7 @@
         </w:rPr>
         <w:t xml:space="preserve">Au niveau algorithmique, </w:t>
       </w:r>
+      <w:proofErr w:type="spellStart"/>
       <w:r>
         <w:rPr>
           <w:b/>
@@ -337,6 +412,7 @@
         </w:rPr>
         <w:t>my_malloc</w:t>
       </w:r>
+      <w:proofErr w:type="spellEnd"/>
       <w:r>
         <w:rPr>
           <w:lang w:eastAsia="fr-FR"/>
@@ -377,7 +453,21 @@
         <w:rPr>
           <w:lang w:eastAsia="fr-FR"/>
         </w:rPr>
-        <w:t xml:space="preserve"> parcourt la heap bloc par bloc afin de trouver un bloc suffisamment grand par rapport à la taille demand</w:t>
+        <w:t xml:space="preserve"> parcourt la </w:t>
+      </w:r>
+      <w:proofErr w:type="spellStart"/>
+      <w:r>
+        <w:rPr>
+          <w:lang w:eastAsia="fr-FR"/>
+        </w:rPr>
+        <w:t>heap</w:t>
+      </w:r>
+      <w:proofErr w:type="spellEnd"/>
+      <w:r>
+        <w:rPr>
+          <w:lang w:eastAsia="fr-FR"/>
+        </w:rPr>
+        <w:t xml:space="preserve"> bloc par bloc afin de trouver un bloc suffisamment grand par rapport à la taille demand</w:t>
       </w:r>
       <w:r>
         <w:rPr>
@@ -515,37 +605,31 @@
         <w:rPr>
           <w:lang w:eastAsia="fr-FR"/>
         </w:rPr>
-        <w:t xml:space="preserve">la marque </w:t>
+        <w:t>la marque comme utilisée (bit de poids</w:t>
+      </w:r>
+      <w:r>
+        <w:rPr>
+          <w:lang w:eastAsia="fr-FR"/>
+        </w:rPr>
+        <w:t xml:space="preserve"> le plus</w:t>
+      </w:r>
+      <w:r>
+        <w:rPr>
+          <w:lang w:eastAsia="fr-FR"/>
+        </w:rPr>
+        <w:t xml:space="preserve"> faible à 1)</w:t>
+      </w:r>
+      <w:r>
+        <w:rPr>
+          <w:lang w:eastAsia="fr-FR"/>
+        </w:rPr>
+        <w:t xml:space="preserve">, crée une nouvelle métadonnée libre </w:t>
       </w:r>
       <w:r>
         <w:rPr>
           <w:lang w:eastAsia="fr-FR"/>
         </w:rPr>
         <w:lastRenderedPageBreak/>
-        <w:t>comme utilisée (bit de poids</w:t>
-      </w:r>
-      <w:r>
-        <w:rPr>
-          <w:lang w:eastAsia="fr-FR"/>
-        </w:rPr>
-        <w:t xml:space="preserve"> le plus</w:t>
-      </w:r>
-      <w:r>
-        <w:rPr>
-          <w:lang w:eastAsia="fr-FR"/>
-        </w:rPr>
-        <w:t xml:space="preserve"> faible à 1)</w:t>
-      </w:r>
-      <w:r>
-        <w:rPr>
-          <w:lang w:eastAsia="fr-FR"/>
-        </w:rPr>
-        <w:t xml:space="preserve">, crée une nouvelle métadonnée libre </w:t>
-      </w:r>
-      <w:r>
-        <w:rPr>
-          <w:lang w:eastAsia="fr-FR"/>
-        </w:rPr>
         <w:t xml:space="preserve">contenant la taille restante </w:t>
       </w:r>
       <w:r>
@@ -616,30 +700,22 @@
       <w:r>
         <w:t xml:space="preserve">Figure </w:t>
       </w:r>
-      <w:r>
-        <w:fldChar w:fldCharType="begin"/>
-      </w:r>
-      <w:r>
-        <w:instrText xml:space="preserve"> SEQ Figure \* ARABIC </w:instrText>
-      </w:r>
-      <w:r>
-        <w:fldChar w:fldCharType="separate"/>
-      </w:r>
-      <w:r>
-        <w:rPr>
-          <w:noProof/>
-        </w:rPr>
-        <w:t>2</w:t>
-      </w:r>
-      <w:r>
-        <w:rPr>
-          <w:noProof/>
-        </w:rPr>
-        <w:fldChar w:fldCharType="end"/>
-      </w:r>
-      <w:r>
-        <w:t xml:space="preserve"> - Mémoire après 3 malloc</w:t>
-      </w:r>
+      <w:fldSimple w:instr=" SEQ Figure \* ARABIC ">
+        <w:r>
+          <w:rPr>
+            <w:noProof/>
+          </w:rPr>
+          <w:t>2</w:t>
+        </w:r>
+      </w:fldSimple>
+      <w:r>
+        <w:t xml:space="preserve"> - Mémoire après 3 </w:t>
+      </w:r>
+      <w:proofErr w:type="spellStart"/>
+      <w:r>
+        <w:t>malloc</w:t>
+      </w:r>
+      <w:proofErr w:type="spellEnd"/>
     </w:p>
     <w:p>
       <w:pPr>
@@ -653,6 +729,7 @@
         </w:rPr>
         <w:t xml:space="preserve">La fonction </w:t>
       </w:r>
+      <w:proofErr w:type="spellStart"/>
       <w:r>
         <w:rPr>
           <w:b/>
@@ -661,11 +738,26 @@
         </w:rPr>
         <w:t>my_free</w:t>
       </w:r>
-      <w:r>
-        <w:rPr>
-          <w:lang w:eastAsia="fr-FR"/>
-        </w:rPr>
-        <w:t xml:space="preserve"> reçoit ce pointeur, recule d'une case pour retrouver le second octet de métadonnées et met son bit de poids faible à 0. Si le pointeur est NULL, elle ne fait rien. On n’efface pas les éventuelles données qui sont écrite dans la heap, celle</w:t>
+      <w:proofErr w:type="spellEnd"/>
+      <w:r>
+        <w:rPr>
+          <w:lang w:eastAsia="fr-FR"/>
+        </w:rPr>
+        <w:t xml:space="preserve"> reçoit ce pointeur, recule d'une case pour retrouver le second octet de métadonnées et met son bit de poids faible à 0. Si le pointeur est NULL, elle ne fait rien. On n’efface pas les éventuelles données qui sont écrite dans la </w:t>
+      </w:r>
+      <w:proofErr w:type="spellStart"/>
+      <w:r>
+        <w:rPr>
+          <w:lang w:eastAsia="fr-FR"/>
+        </w:rPr>
+        <w:t>heap</w:t>
+      </w:r>
+      <w:proofErr w:type="spellEnd"/>
+      <w:r>
+        <w:rPr>
+          <w:lang w:eastAsia="fr-FR"/>
+        </w:rPr>
+        <w:t>, celle</w:t>
       </w:r>
       <w:r>
         <w:rPr>
@@ -789,27 +881,14 @@
       <w:r>
         <w:t xml:space="preserve">Figure </w:t>
       </w:r>
-      <w:r>
-        <w:fldChar w:fldCharType="begin"/>
-      </w:r>
-      <w:r>
-        <w:instrText xml:space="preserve"> SEQ Figure \* ARABIC </w:instrText>
-      </w:r>
-      <w:r>
-        <w:fldChar w:fldCharType="separate"/>
-      </w:r>
-      <w:r>
-        <w:rPr>
-          <w:noProof/>
-        </w:rPr>
-        <w:t>3</w:t>
-      </w:r>
-      <w:r>
-        <w:rPr>
-          <w:noProof/>
-        </w:rPr>
-        <w:fldChar w:fldCharType="end"/>
-      </w:r>
+      <w:fldSimple w:instr=" SEQ Figure \* ARABIC ">
+        <w:r>
+          <w:rPr>
+            <w:noProof/>
+          </w:rPr>
+          <w:t>3</w:t>
+        </w:r>
+      </w:fldSimple>
       <w:r>
         <w:t xml:space="preserve"> - Mémoire après le free du bloc de 13 octets</w:t>
       </w:r>
@@ -854,13 +933,49 @@
         <w:t>tests</w:t>
       </w:r>
       <w:r>
-        <w:t xml:space="preserve"> Inginious (</w:t>
+        <w:t xml:space="preserve"> </w:t>
+      </w:r>
+      <w:proofErr w:type="spellStart"/>
+      <w:r>
+        <w:t>Inginious</w:t>
+      </w:r>
+      <w:proofErr w:type="spellEnd"/>
+      <w:r>
+        <w:t xml:space="preserve"> (</w:t>
       </w:r>
       <w:r>
         <w:rPr>
           <w:lang w:val="en-BE"/>
         </w:rPr>
-        <w:t>Test : my_malloc() et my_free() de gros blocs</w:t>
+        <w:t xml:space="preserve">Test : </w:t>
+      </w:r>
+      <w:proofErr w:type="spellStart"/>
+      <w:r>
+        <w:rPr>
+          <w:lang w:val="en-BE"/>
+        </w:rPr>
+        <w:t>my_malloc</w:t>
+      </w:r>
+      <w:proofErr w:type="spellEnd"/>
+      <w:r>
+        <w:rPr>
+          <w:lang w:val="en-BE"/>
+        </w:rPr>
+        <w:t xml:space="preserve">() et </w:t>
+      </w:r>
+      <w:proofErr w:type="spellStart"/>
+      <w:r>
+        <w:rPr>
+          <w:lang w:val="en-BE"/>
+        </w:rPr>
+        <w:t>my_free</w:t>
+      </w:r>
+      <w:proofErr w:type="spellEnd"/>
+      <w:r>
+        <w:rPr>
+          <w:lang w:val="en-BE"/>
+        </w:rPr>
+        <w:t>() de gros blocs</w:t>
       </w:r>
       <w:r>
         <w:t>)</w:t>
@@ -1542,6 +1657,7 @@
   <w:style w:type="character" w:default="1" w:styleId="DefaultParagraphFont">
     <w:name w:val="Default Paragraph Font"/>
     <w:uiPriority w:val="1"/>
+    <w:semiHidden/>
     <w:unhideWhenUsed/>
   </w:style>
   <w:style w:type="table" w:default="1" w:styleId="TableNormal">

</xml_diff>